<commit_message>
Mi descripción de cambios
</commit_message>
<xml_diff>
--- a/GitHubDashBoardExcelSIS.docx
+++ b/GitHubDashBoardExcelSIS.docx
@@ -4,7 +4,7 @@
   <w:body>
     <w:p>
       <w:pPr>
-        <w:ind w:left="708" w:hanging="708"/>
+        <w:ind w:left="2124" w:hanging="2124"/>
         <w:rPr>
           <w:lang w:val="en-US"/>
         </w:rPr>
@@ -15,7 +15,7 @@
           <w:lang w:val="en-US"/>
         </w:rPr>
         <w:drawing>
-          <wp:anchor distT="0" distB="0" distL="114300" distR="114300" simplePos="0" relativeHeight="251658240" behindDoc="0" locked="0" layoutInCell="1" allowOverlap="1" wp14:anchorId="249FC78D" wp14:editId="7476FB15">
+          <wp:anchor distT="0" distB="0" distL="114300" distR="114300" simplePos="0" relativeHeight="251658240" behindDoc="0" locked="0" layoutInCell="1" allowOverlap="1" wp14:anchorId="249FC78D" wp14:editId="2A8F01E6">
             <wp:simplePos x="0" y="0"/>
             <wp:positionH relativeFrom="column">
               <wp:posOffset>1905</wp:posOffset>
@@ -578,6 +578,16 @@
           <w:tab w:val="left" w:pos="1140"/>
         </w:tabs>
         <w:rPr>
+          <w:lang w:val="en-US"/>
+        </w:rPr>
+      </w:pPr>
+    </w:p>
+    <w:p>
+      <w:pPr>
+        <w:tabs>
+          <w:tab w:val="left" w:pos="1140"/>
+        </w:tabs>
+        <w:rPr>
           <w:sz w:val="36"/>
           <w:szCs w:val="36"/>
         </w:rPr>
@@ -681,6 +691,7 @@
           <w:b/>
           <w:bCs/>
         </w:rPr>
+        <w:lastRenderedPageBreak/>
         <w:t>En tu caso:</w:t>
       </w:r>
     </w:p>
@@ -701,7 +712,6 @@
           <w:b/>
           <w:bCs/>
         </w:rPr>
-        <w:lastRenderedPageBreak/>
         <w:t>D:\proyectos_python\DashboardExcelSIS</w:t>
       </w:r>
     </w:p>
@@ -1666,6 +1676,7 @@
           <w:b/>
           <w:bCs/>
         </w:rPr>
+        <w:lastRenderedPageBreak/>
         <w:t xml:space="preserve">Actualizo </w:t>
       </w:r>
       <w:proofErr w:type="spellStart"/>
@@ -1708,7 +1719,6 @@
           <w:b/>
           <w:bCs/>
         </w:rPr>
-        <w:lastRenderedPageBreak/>
         <w:t xml:space="preserve">Presiona </w:t>
       </w:r>
       <w:proofErr w:type="spellStart"/>

</xml_diff>